<commit_message>
fix(branding): rename all graph labels, legends, and report headers to CycML
</commit_message>
<xml_diff>
--- a/reports/START_TO_FINISH_PROJECT_REPORT.docx
+++ b/reports/START_TO_FINISH_PROJECT_REPORT.docx
@@ -13,7 +13,7 @@
           <w:color w:val="10366E"/>
           <w:sz w:val="44"/>
         </w:rPr>
-        <w:t>DeepCycloNet: Start-to-Finish Project Report</w:t>
+        <w:t>CycML: Start-to-Finish Project Report</w:t>
       </w:r>
     </w:p>
     <w:p>
@@ -302,7 +302,7 @@
           <w:color w:val="212529"/>
           <w:sz w:val="20"/>
         </w:rPr>
-        <w:t>To ensure true operational reliability across global cyclone basins, we trained and evaluated DeepCycloNet on the comprehensive Tropical Cyclone Image Dataset (TCIR), spanning 70,499 satellite images across 1,285 unique tropical cyclones over 15+ continuous years (1998–2017).</w:t>
+        <w:t>To ensure true operational reliability across global cyclone basins, we trained and evaluated CycML on the comprehensive Tropical Cyclone Image Dataset (TCIR), spanning 70,499 satellite images across 1,285 unique tropical cyclones over 15+ continuous years (1998–2017).</w:t>
       </w:r>
     </w:p>
     <w:p>
@@ -534,7 +534,7 @@
           <w:color w:val="10366E"/>
           <w:sz w:val="32"/>
         </w:rPr>
-        <w:t>Chapter 3: The DeepCycloNet Solution (How the AI Works)</w:t>
+        <w:t>Chapter 3: The CycML Solution (How the AI Works)</w:t>
       </w:r>
     </w:p>
     <w:p>
@@ -547,7 +547,7 @@
           <w:color w:val="212529"/>
           <w:sz w:val="20"/>
         </w:rPr>
-        <w:t>DeepCycloNet combines spatial computer vision, historical time-series memory, and oceanic physics into a unified multi-modal neural architecture.</w:t>
+        <w:t>CycML combines spatial computer vision, historical time-series memory, and oceanic physics into a unified multi-modal neural architecture.</w:t>
       </w:r>
     </w:p>
     <w:p>
@@ -603,7 +603,7 @@
           <w:color w:val="64748B"/>
           <w:sz w:val="18"/>
         </w:rPr>
-        <w:t>Figure 1: DeepCycloNet End-to-End Multi-Modal AI Architecture Flowchart (Inputs → Fusion Transformer → 3 Operational Heads).</w:t>
+        <w:t>Figure 1: CycML End-to-End Multi-Modal AI Architecture Flowchart (Inputs → Fusion Transformer → 3 Operational Heads).</w:t>
       </w:r>
     </w:p>
     <w:p>
@@ -718,7 +718,7 @@
           <w:color w:val="212529"/>
           <w:sz w:val="20"/>
         </w:rPr>
-        <w:t>Rather than outputting a single ambiguous number, DeepCycloNet provides three synchronized operational outputs designed for actionable decision-making:</w:t>
+        <w:t>Rather than outputting a single ambiguous number, CycML provides three synchronized operational outputs designed for actionable decision-making:</w:t>
       </w:r>
     </w:p>
     <w:p>
@@ -917,7 +917,7 @@
           <w:color w:val="212529"/>
           <w:sz w:val="20"/>
         </w:rPr>
-        <w:t>Across 35 consecutive operational cycles spanning over 100 hours of storm lifecycle, DeepCycloNet achieved a remarkable +24h Mean Absolute Error of just 5.46 knots and a 94.3% trend classification accuracy. The AI anticipated both the rapid intensification ramp to 105 kt and the post-peak weakening phase.</w:t>
+        <w:t>Across 35 consecutive operational cycles spanning over 100 hours of storm lifecycle, CycML achieved a remarkable +24h Mean Absolute Error of just 5.46 knots and a 94.3% trend classification accuracy. The AI anticipated both the rapid intensification ramp to 105 kt and the post-peak weakening phase.</w:t>
       </w:r>
     </w:p>
     <w:p>
@@ -945,7 +945,7 @@
           <w:color w:val="212529"/>
           <w:sz w:val="20"/>
         </w:rPr>
-        <w:t>Tracking Blas as it developed from a 65 kt tropical storm into a 120 kt major hurricane, DeepCycloNet achieved a +24h MAE of 6.63 knots and an 83.1% trend accuracy, accurately capturing the peak eyewall strength without over-prediction or delay.</w:t>
+        <w:t>Tracking Blas as it developed from a 65 kt tropical storm into a 120 kt major hurricane, CycML achieved a +24h MAE of 6.63 knots and an 83.1% trend accuracy, accurately capturing the peak eyewall strength without over-prediction or delay.</w:t>
       </w:r>
     </w:p>
     <w:p>
@@ -973,7 +973,7 @@
           <w:color w:val="212529"/>
           <w:sz w:val="20"/>
         </w:rPr>
-        <w:t>In May 2010, Super Cyclone Phet threatened coastal Oman and Pakistan. DeepCycloNet's RI early warning engine surged past the critical hazard threshold 18 hours before Phet reached its Category 4 peak, providing crucial lead time before severe coastal impacts occurred.</w:t>
+        <w:t>In May 2010, Super Cyclone Phet threatened coastal Oman and Pakistan. CycML's RI early warning engine surged past the critical hazard threshold 18 hours before Phet reached its Category 4 peak, providing crucial lead time before severe coastal impacts occurred.</w:t>
       </w:r>
     </w:p>
     <w:p>
@@ -1004,7 +1004,7 @@
           <w:color w:val="212529"/>
           <w:sz w:val="20"/>
         </w:rPr>
-        <w:t>We compared DeepCycloNet's continuous wind speed forecast errors against authoritative operational benchmarks from the India Meteorological Department (IMD) and the Joint Typhoon Warning Center (JTWC).</w:t>
+        <w:t>We compared CycML's continuous wind speed forecast errors against authoritative operational benchmarks from the India Meteorological Department (IMD) and the Joint Typhoon Warning Center (JTWC).</w:t>
       </w:r>
     </w:p>
     <w:p>
@@ -1150,7 +1150,7 @@
                 <w:color w:val="FFFFFF"/>
                 <w:sz w:val="19"/>
               </w:rPr>
-              <w:t>DeepCycloNet AI Error</w:t>
+              <w:t>CycML AI Error</w:t>
             </w:r>
           </w:p>
         </w:tc>
@@ -1934,7 +1934,7 @@
           <w:color w:val="0369A1"/>
           <w:sz w:val="26"/>
         </w:rPr>
-        <w:t>2. What We Did (DeepCycloNet Innovation):</w:t>
+        <w:t>2. What We Did (CycML Innovation):</w:t>
       </w:r>
     </w:p>
     <w:p>
@@ -2062,7 +2062,7 @@
           <w:color w:val="212529"/>
           <w:sz w:val="20"/>
         </w:rPr>
-        <w:t>DeepCycloNet directly answers Smart India Hackathon Problem Statement 26070 by delivering an end-to-end, scientifically validated, and operationally deployed tropical cyclone intelligence system.</w:t>
+        <w:t>CycML directly answers Smart India Hackathon Problem Statement 26070 by delivering an end-to-end, scientifically validated, and operationally deployed tropical cyclone intelligence system.</w:t>
       </w:r>
     </w:p>
     <w:tbl>

</xml_diff>